<commit_message>
Renomeia campanha de Síndicos e adiciona projeção de seguidores out/2026 a jan/2027
Co-Authored-By: Claude Sonnet 5 <noreply@anthropic.com>
Claude-Session: https://claude.ai/code/session_01GQSqEjEuqv44iBdACeUWUZ
</commit_message>
<xml_diff>
--- a/eleva/analise-crescimento-seguidores-jul-set-2026.docx
+++ b/eleva/analise-crescimento-seguidores-jul-set-2026.docx
@@ -968,7 +968,7 @@
                 <w:sz w:val="19"/>
                 <w:szCs w:val="19"/>
               </w:rPr>
-              <w:t xml:space="preserve">Curso Síndicos - Engajamento</w:t>
+              <w:t xml:space="preserve">Síndicos - Engajamento</w:t>
             </w:r>
           </w:p>
         </w:tc>
@@ -1271,6 +1271,308 @@
           <w:szCs w:val="21"/>
         </w:rPr>
         <w:t xml:space="preserve">Sim. Para um perfil B2B/de nicho (síndicos e executivos de administradoras, público racional e de decisão lenta), o volume de seguidores novos por mês tende a ser baixo mesmo com bom desempenho de conteúdo, esse público segue perfis por autoridade construída ao longo do tempo, não por impulso. O que importa mais nessa fase é o que já está acontecendo: alcance de não seguidores subindo, custo por visita em queda constante, e visualizações triplicando de um patamar para outro em um único mês.</w:t>
+      </w:r>
+    </w:p>
+    <w:p>
+      <w:pPr>
+        <w:pStyle w:val="Heading2"/>
+        <w:keepNext/>
+        <w:spacing w:after="150" w:before="300"/>
+      </w:pPr>
+      <w:r>
+        <w:t xml:space="preserve">Projeção de seguidores — outubro/2026 a janeiro/2027</w:t>
+      </w:r>
+    </w:p>
+    <w:p>
+      <w:pPr>
+        <w:spacing w:after="160"/>
+      </w:pPr>
+      <w:r>
+        <w:rPr>
+          <w:sz w:val="21"/>
+          <w:szCs w:val="21"/>
+        </w:rPr>
+        <w:t xml:space="preserve">Mantendo o investimento atual de R$25/dia na campanha de Executivos e R$25/dia na campanha de Síndicos (R$50/dia no total), a expectativa para os 4 meses seguintes (outubro, novembro, dezembro/2026 e janeiro/2027):</w:t>
+      </w:r>
+    </w:p>
+    <w:tbl>
+      <w:tblPr>
+        <w:tblW w:type="dxa" w:w="9026"/>
+        <w:tblBorders>
+          <w:top w:val="single" w:color="auto" w:sz="4"/>
+          <w:left w:val="single" w:color="auto" w:sz="4"/>
+          <w:bottom w:val="single" w:color="auto" w:sz="4"/>
+          <w:right w:val="single" w:color="auto" w:sz="4"/>
+          <w:insideH w:val="single" w:color="auto" w:sz="4"/>
+          <w:insideV w:val="single" w:color="auto" w:sz="4"/>
+        </w:tblBorders>
+      </w:tblPr>
+      <w:tblGrid>
+        <w:gridCol w:w="3008"/>
+        <w:gridCol w:w="3008"/>
+        <w:gridCol w:w="3008"/>
+      </w:tblGrid>
+      <w:tr>
+        <w:tc>
+          <w:tcPr>
+            <w:tcW w:type="dxa" w:w="3008"/>
+            <w:shd w:fill="1c2b4a" w:val="clear"/>
+          </w:tcPr>
+          <w:p>
+            <w:r>
+              <w:rPr>
+                <w:b/>
+                <w:bCs/>
+                <w:color w:val="FFFFFF"/>
+                <w:sz w:val="19"/>
+                <w:szCs w:val="19"/>
+              </w:rPr>
+              <w:t xml:space="preserve">Cenário</w:t>
+            </w:r>
+          </w:p>
+        </w:tc>
+        <w:tc>
+          <w:tcPr>
+            <w:tcW w:type="dxa" w:w="3008"/>
+            <w:shd w:fill="1c2b4a" w:val="clear"/>
+          </w:tcPr>
+          <w:p>
+            <w:r>
+              <w:rPr>
+                <w:b/>
+                <w:bCs/>
+                <w:color w:val="FFFFFF"/>
+                <w:sz w:val="19"/>
+                <w:szCs w:val="19"/>
+              </w:rPr>
+              <w:t xml:space="preserve">Novos seguidores/mês</w:t>
+            </w:r>
+          </w:p>
+        </w:tc>
+        <w:tc>
+          <w:tcPr>
+            <w:tcW w:type="dxa" w:w="3008"/>
+            <w:shd w:fill="1c2b4a" w:val="clear"/>
+          </w:tcPr>
+          <w:p>
+            <w:r>
+              <w:rPr>
+                <w:b/>
+                <w:bCs/>
+                <w:color w:val="FFFFFF"/>
+                <w:sz w:val="19"/>
+                <w:szCs w:val="19"/>
+              </w:rPr>
+              <w:t xml:space="preserve">Total no período (4 meses)</w:t>
+            </w:r>
+          </w:p>
+        </w:tc>
+      </w:tr>
+      <w:tr>
+        <w:tc>
+          <w:tcPr>
+            <w:tcW w:type="dxa" w:w="3008"/>
+          </w:tcPr>
+          <w:p>
+            <w:r>
+              <w:rPr>
+                <w:b w:val="false"/>
+                <w:bCs w:val="false"/>
+                <w:color w:val="000000"/>
+                <w:sz w:val="19"/>
+                <w:szCs w:val="19"/>
+              </w:rPr>
+              <w:t xml:space="preserve">Conservador</w:t>
+            </w:r>
+          </w:p>
+        </w:tc>
+        <w:tc>
+          <w:tcPr>
+            <w:tcW w:type="dxa" w:w="3008"/>
+          </w:tcPr>
+          <w:p>
+            <w:r>
+              <w:rPr>
+                <w:b w:val="false"/>
+                <w:bCs w:val="false"/>
+                <w:color w:val="000000"/>
+                <w:sz w:val="19"/>
+                <w:szCs w:val="19"/>
+              </w:rPr>
+              <w:t xml:space="preserve">~50</w:t>
+            </w:r>
+          </w:p>
+        </w:tc>
+        <w:tc>
+          <w:tcPr>
+            <w:tcW w:type="dxa" w:w="3008"/>
+          </w:tcPr>
+          <w:p>
+            <w:r>
+              <w:rPr>
+                <w:b w:val="false"/>
+                <w:bCs w:val="false"/>
+                <w:color w:val="000000"/>
+                <w:sz w:val="19"/>
+                <w:szCs w:val="19"/>
+              </w:rPr>
+              <w:t xml:space="preserve">+200</w:t>
+            </w:r>
+          </w:p>
+        </w:tc>
+      </w:tr>
+      <w:tr>
+        <w:tc>
+          <w:tcPr>
+            <w:tcW w:type="dxa" w:w="3008"/>
+          </w:tcPr>
+          <w:p>
+            <w:r>
+              <w:rPr>
+                <w:b w:val="false"/>
+                <w:bCs w:val="false"/>
+                <w:color w:val="000000"/>
+                <w:sz w:val="19"/>
+                <w:szCs w:val="19"/>
+              </w:rPr>
+              <w:t xml:space="preserve">Realista</w:t>
+            </w:r>
+          </w:p>
+        </w:tc>
+        <w:tc>
+          <w:tcPr>
+            <w:tcW w:type="dxa" w:w="3008"/>
+          </w:tcPr>
+          <w:p>
+            <w:r>
+              <w:rPr>
+                <w:b w:val="false"/>
+                <w:bCs w:val="false"/>
+                <w:color w:val="000000"/>
+                <w:sz w:val="19"/>
+                <w:szCs w:val="19"/>
+              </w:rPr>
+              <w:t xml:space="preserve">~60 (média de setembro)</w:t>
+            </w:r>
+          </w:p>
+        </w:tc>
+        <w:tc>
+          <w:tcPr>
+            <w:tcW w:type="dxa" w:w="3008"/>
+          </w:tcPr>
+          <w:p>
+            <w:r>
+              <w:rPr>
+                <w:b w:val="false"/>
+                <w:bCs w:val="false"/>
+                <w:color w:val="000000"/>
+                <w:sz w:val="19"/>
+                <w:szCs w:val="19"/>
+              </w:rPr>
+              <w:t xml:space="preserve">+240</w:t>
+            </w:r>
+          </w:p>
+        </w:tc>
+      </w:tr>
+      <w:tr>
+        <w:tc>
+          <w:tcPr>
+            <w:tcW w:type="dxa" w:w="3008"/>
+          </w:tcPr>
+          <w:p>
+            <w:r>
+              <w:rPr>
+                <w:b w:val="false"/>
+                <w:bCs w:val="false"/>
+                <w:color w:val="000000"/>
+                <w:sz w:val="19"/>
+                <w:szCs w:val="19"/>
+              </w:rPr>
+              <w:t xml:space="preserve">Otimista</w:t>
+            </w:r>
+          </w:p>
+        </w:tc>
+        <w:tc>
+          <w:tcPr>
+            <w:tcW w:type="dxa" w:w="3008"/>
+          </w:tcPr>
+          <w:p>
+            <w:r>
+              <w:rPr>
+                <w:b w:val="false"/>
+                <w:bCs w:val="false"/>
+                <w:color w:val="000000"/>
+                <w:sz w:val="19"/>
+                <w:szCs w:val="19"/>
+              </w:rPr>
+              <w:t xml:space="preserve">~70 a 75</w:t>
+            </w:r>
+          </w:p>
+        </w:tc>
+        <w:tc>
+          <w:tcPr>
+            <w:tcW w:type="dxa" w:w="3008"/>
+          </w:tcPr>
+          <w:p>
+            <w:r>
+              <w:rPr>
+                <w:b w:val="false"/>
+                <w:bCs w:val="false"/>
+                <w:color w:val="000000"/>
+                <w:sz w:val="19"/>
+                <w:szCs w:val="19"/>
+              </w:rPr>
+              <w:t xml:space="preserve">+280 a +300</w:t>
+            </w:r>
+          </w:p>
+        </w:tc>
+      </w:tr>
+    </w:tbl>
+    <w:p>
+      <w:pPr>
+        <w:spacing w:after="160"/>
+      </w:pPr>
+    </w:p>
+    <w:p>
+      <w:pPr>
+        <w:spacing w:after="160"/>
+      </w:pPr>
+      <w:r>
+        <w:rPr>
+          <w:b/>
+          <w:bCs/>
+          <w:sz w:val="21"/>
+          <w:szCs w:val="21"/>
+        </w:rPr>
+        <w:t xml:space="preserve">Por que essa faixa:</w:t>
+      </w:r>
+      <w:r>
+        <w:rPr>
+          <w:sz w:val="21"/>
+          <w:szCs w:val="21"/>
+        </w:rPr>
+        <w:t xml:space="preserve"> setembro fechou em 60 novos seguidores, número menor que julho (100) porque as campanhas atuais são de engajamento, não de conversão direta como as de julho, mas com qualidade de alcance muito superior (90% de não seguidores, custo por visita em queda). O cenário realista assume que esse ritmo se mantém estável. O otimista considera que a curva de visualizações, que já triplicou de agosto para setembro, continue subindo e traga mais gente nova ao perfil. O conservador considera uma leve acomodação, comum depois de um salto de patamar como o que aconteceu em setembro.</w:t>
+      </w:r>
+    </w:p>
+    <w:p>
+      <w:pPr>
+        <w:spacing w:after="160"/>
+      </w:pPr>
+      <w:r>
+        <w:rPr>
+          <w:b/>
+          <w:bCs/>
+          <w:sz w:val="21"/>
+          <w:szCs w:val="21"/>
+        </w:rPr>
+        <w:t xml:space="preserve">Importante:</w:t>
+      </w:r>
+      <w:r>
+        <w:rPr>
+          <w:sz w:val="21"/>
+          <w:szCs w:val="21"/>
+        </w:rPr>
+        <w:t xml:space="preserve"> esse número é sobre seguidores, não sobre vendas. Para um público B2B de decisão lenta como síndicos e executivos de administradoras, o crescimento de seguidor é consequência de autoridade construída ao longo do tempo, o resultado comercial (Diagnóstico e Mentoria) tende a vir depois desse período de maturação, não junto com o pico de seguidores.</w:t>
       </w:r>
     </w:p>
     <w:p>

</xml_diff>

<commit_message>
Adiciona custo por seguidor de setembro e detalha projeção mês a mês até dezembro/2026 e janeiro/2027
Co-Authored-By: Claude Sonnet 5 <noreply@anthropic.com>
Claude-Session: https://claude.ai/code/session_01GQSqEjEuqv44iBdACeUWUZ
</commit_message>
<xml_diff>
--- a/eleva/analise-crescimento-seguidores-jul-set-2026.docx
+++ b/eleva/analise-crescimento-seguidores-jul-set-2026.docx
@@ -1118,6 +1118,43 @@
       </w:pPr>
       <w:r>
         <w:rPr>
+          <w:b/>
+          <w:bCs/>
+          <w:sz w:val="21"/>
+          <w:szCs w:val="21"/>
+        </w:rPr>
+        <w:t xml:space="preserve">Custo por seguidor em setembro:</w:t>
+      </w:r>
+      <w:r>
+        <w:rPr>
+          <w:sz w:val="21"/>
+          <w:szCs w:val="21"/>
+        </w:rPr>
+        <w:t xml:space="preserve"> R$1.091,46 investidos / 60 novos seguidores no mês = aproximadamente </w:t>
+      </w:r>
+      <w:r>
+        <w:rPr>
+          <w:b/>
+          <w:bCs/>
+          <w:sz w:val="21"/>
+          <w:szCs w:val="21"/>
+        </w:rPr>
+        <w:t xml:space="preserve">R$18,19 por seguidor</w:t>
+      </w:r>
+      <w:r>
+        <w:rPr>
+          <w:sz w:val="21"/>
+          <w:szCs w:val="21"/>
+        </w:rPr>
+        <w:t xml:space="preserve">. Vale lembrar que esse número é uma referência indireta, já que a campanha é de engajamento (visitas ao perfil), não de "seguir a página", parte desses 60 seguidores vem de conversão orgânica somada ao efeito da verba paga, não só de quem clicou direto no anúncio.</w:t>
+      </w:r>
+    </w:p>
+    <w:p>
+      <w:pPr>
+        <w:spacing w:after="160"/>
+      </w:pPr>
+      <w:r>
+        <w:rPr>
           <w:sz w:val="21"/>
           <w:szCs w:val="21"/>
         </w:rPr>
@@ -1308,14 +1345,15 @@
         </w:tblBorders>
       </w:tblPr>
       <w:tblGrid>
-        <w:gridCol w:w="3008"/>
-        <w:gridCol w:w="3008"/>
-        <w:gridCol w:w="3008"/>
+        <w:gridCol w:w="2256"/>
+        <w:gridCol w:w="2256"/>
+        <w:gridCol w:w="2256"/>
+        <w:gridCol w:w="2256"/>
       </w:tblGrid>
       <w:tr>
         <w:tc>
           <w:tcPr>
-            <w:tcW w:type="dxa" w:w="3008"/>
+            <w:tcW w:type="dxa" w:w="2256"/>
             <w:shd w:fill="1c2b4a" w:val="clear"/>
           </w:tcPr>
           <w:p>
@@ -1327,13 +1365,13 @@
                 <w:sz w:val="19"/>
                 <w:szCs w:val="19"/>
               </w:rPr>
-              <w:t xml:space="preserve">Cenário</w:t>
-            </w:r>
-          </w:p>
-        </w:tc>
-        <w:tc>
-          <w:tcPr>
-            <w:tcW w:type="dxa" w:w="3008"/>
+              <w:t xml:space="preserve">Mês</w:t>
+            </w:r>
+          </w:p>
+        </w:tc>
+        <w:tc>
+          <w:tcPr>
+            <w:tcW w:type="dxa" w:w="2256"/>
             <w:shd w:fill="1c2b4a" w:val="clear"/>
           </w:tcPr>
           <w:p>
@@ -1345,13 +1383,13 @@
                 <w:sz w:val="19"/>
                 <w:szCs w:val="19"/>
               </w:rPr>
-              <w:t xml:space="preserve">Novos seguidores/mês</w:t>
-            </w:r>
-          </w:p>
-        </w:tc>
-        <w:tc>
-          <w:tcPr>
-            <w:tcW w:type="dxa" w:w="3008"/>
+              <w:t xml:space="preserve">Conservador (~50/mês)</w:t>
+            </w:r>
+          </w:p>
+        </w:tc>
+        <w:tc>
+          <w:tcPr>
+            <w:tcW w:type="dxa" w:w="2256"/>
             <w:shd w:fill="1c2b4a" w:val="clear"/>
           </w:tcPr>
           <w:p>
@@ -1363,7 +1401,25 @@
                 <w:sz w:val="19"/>
                 <w:szCs w:val="19"/>
               </w:rPr>
-              <w:t xml:space="preserve">Total no período (4 meses)</w:t>
+              <w:t xml:space="preserve">Realista (~60/mês)</w:t>
+            </w:r>
+          </w:p>
+        </w:tc>
+        <w:tc>
+          <w:tcPr>
+            <w:tcW w:type="dxa" w:w="2256"/>
+            <w:shd w:fill="1c2b4a" w:val="clear"/>
+          </w:tcPr>
+          <w:p>
+            <w:r>
+              <w:rPr>
+                <w:b/>
+                <w:bCs/>
+                <w:color w:val="FFFFFF"/>
+                <w:sz w:val="19"/>
+                <w:szCs w:val="19"/>
+              </w:rPr>
+              <w:t xml:space="preserve">Otimista (~70-75/mês)</w:t>
             </w:r>
           </w:p>
         </w:tc>
@@ -1371,52 +1427,69 @@
       <w:tr>
         <w:tc>
           <w:tcPr>
-            <w:tcW w:type="dxa" w:w="3008"/>
-          </w:tcPr>
-          <w:p>
-            <w:r>
-              <w:rPr>
-                <w:b w:val="false"/>
-                <w:bCs w:val="false"/>
-                <w:color w:val="000000"/>
-                <w:sz w:val="19"/>
-                <w:szCs w:val="19"/>
-              </w:rPr>
-              <w:t xml:space="preserve">Conservador</w:t>
-            </w:r>
-          </w:p>
-        </w:tc>
-        <w:tc>
-          <w:tcPr>
-            <w:tcW w:type="dxa" w:w="3008"/>
-          </w:tcPr>
-          <w:p>
-            <w:r>
-              <w:rPr>
-                <w:b w:val="false"/>
-                <w:bCs w:val="false"/>
-                <w:color w:val="000000"/>
-                <w:sz w:val="19"/>
-                <w:szCs w:val="19"/>
-              </w:rPr>
-              <w:t xml:space="preserve">~50</w:t>
-            </w:r>
-          </w:p>
-        </w:tc>
-        <w:tc>
-          <w:tcPr>
-            <w:tcW w:type="dxa" w:w="3008"/>
-          </w:tcPr>
-          <w:p>
-            <w:r>
-              <w:rPr>
-                <w:b w:val="false"/>
-                <w:bCs w:val="false"/>
-                <w:color w:val="000000"/>
-                <w:sz w:val="19"/>
-                <w:szCs w:val="19"/>
-              </w:rPr>
-              <w:t xml:space="preserve">+200</w:t>
+            <w:tcW w:type="dxa" w:w="2256"/>
+          </w:tcPr>
+          <w:p>
+            <w:r>
+              <w:rPr>
+                <w:b w:val="false"/>
+                <w:bCs w:val="false"/>
+                <w:color w:val="000000"/>
+                <w:sz w:val="19"/>
+                <w:szCs w:val="19"/>
+              </w:rPr>
+              <w:t xml:space="preserve">Outubro/2026</w:t>
+            </w:r>
+          </w:p>
+        </w:tc>
+        <w:tc>
+          <w:tcPr>
+            <w:tcW w:type="dxa" w:w="2256"/>
+          </w:tcPr>
+          <w:p>
+            <w:r>
+              <w:rPr>
+                <w:b w:val="false"/>
+                <w:bCs w:val="false"/>
+                <w:color w:val="000000"/>
+                <w:sz w:val="19"/>
+                <w:szCs w:val="19"/>
+              </w:rPr>
+              <w:t xml:space="preserve">50</w:t>
+            </w:r>
+          </w:p>
+        </w:tc>
+        <w:tc>
+          <w:tcPr>
+            <w:tcW w:type="dxa" w:w="2256"/>
+          </w:tcPr>
+          <w:p>
+            <w:r>
+              <w:rPr>
+                <w:b w:val="false"/>
+                <w:bCs w:val="false"/>
+                <w:color w:val="000000"/>
+                <w:sz w:val="19"/>
+                <w:szCs w:val="19"/>
+              </w:rPr>
+              <w:t xml:space="preserve">60</w:t>
+            </w:r>
+          </w:p>
+        </w:tc>
+        <w:tc>
+          <w:tcPr>
+            <w:tcW w:type="dxa" w:w="2256"/>
+          </w:tcPr>
+          <w:p>
+            <w:r>
+              <w:rPr>
+                <w:b w:val="false"/>
+                <w:bCs w:val="false"/>
+                <w:color w:val="000000"/>
+                <w:sz w:val="19"/>
+                <w:szCs w:val="19"/>
+              </w:rPr>
+              <w:t xml:space="preserve">70-75</w:t>
             </w:r>
           </w:p>
         </w:tc>
@@ -1424,52 +1497,69 @@
       <w:tr>
         <w:tc>
           <w:tcPr>
-            <w:tcW w:type="dxa" w:w="3008"/>
-          </w:tcPr>
-          <w:p>
-            <w:r>
-              <w:rPr>
-                <w:b w:val="false"/>
-                <w:bCs w:val="false"/>
-                <w:color w:val="000000"/>
-                <w:sz w:val="19"/>
-                <w:szCs w:val="19"/>
-              </w:rPr>
-              <w:t xml:space="preserve">Realista</w:t>
-            </w:r>
-          </w:p>
-        </w:tc>
-        <w:tc>
-          <w:tcPr>
-            <w:tcW w:type="dxa" w:w="3008"/>
-          </w:tcPr>
-          <w:p>
-            <w:r>
-              <w:rPr>
-                <w:b w:val="false"/>
-                <w:bCs w:val="false"/>
-                <w:color w:val="000000"/>
-                <w:sz w:val="19"/>
-                <w:szCs w:val="19"/>
-              </w:rPr>
-              <w:t xml:space="preserve">~60 (média de setembro)</w:t>
-            </w:r>
-          </w:p>
-        </w:tc>
-        <w:tc>
-          <w:tcPr>
-            <w:tcW w:type="dxa" w:w="3008"/>
-          </w:tcPr>
-          <w:p>
-            <w:r>
-              <w:rPr>
-                <w:b w:val="false"/>
-                <w:bCs w:val="false"/>
-                <w:color w:val="000000"/>
-                <w:sz w:val="19"/>
-                <w:szCs w:val="19"/>
-              </w:rPr>
-              <w:t xml:space="preserve">+240</w:t>
+            <w:tcW w:type="dxa" w:w="2256"/>
+          </w:tcPr>
+          <w:p>
+            <w:r>
+              <w:rPr>
+                <w:b w:val="false"/>
+                <w:bCs w:val="false"/>
+                <w:color w:val="000000"/>
+                <w:sz w:val="19"/>
+                <w:szCs w:val="19"/>
+              </w:rPr>
+              <w:t xml:space="preserve">Novembro/2026</w:t>
+            </w:r>
+          </w:p>
+        </w:tc>
+        <w:tc>
+          <w:tcPr>
+            <w:tcW w:type="dxa" w:w="2256"/>
+          </w:tcPr>
+          <w:p>
+            <w:r>
+              <w:rPr>
+                <w:b w:val="false"/>
+                <w:bCs w:val="false"/>
+                <w:color w:val="000000"/>
+                <w:sz w:val="19"/>
+                <w:szCs w:val="19"/>
+              </w:rPr>
+              <w:t xml:space="preserve">100 (acumulado)</w:t>
+            </w:r>
+          </w:p>
+        </w:tc>
+        <w:tc>
+          <w:tcPr>
+            <w:tcW w:type="dxa" w:w="2256"/>
+          </w:tcPr>
+          <w:p>
+            <w:r>
+              <w:rPr>
+                <w:b w:val="false"/>
+                <w:bCs w:val="false"/>
+                <w:color w:val="000000"/>
+                <w:sz w:val="19"/>
+                <w:szCs w:val="19"/>
+              </w:rPr>
+              <w:t xml:space="preserve">120 (acumulado)</w:t>
+            </w:r>
+          </w:p>
+        </w:tc>
+        <w:tc>
+          <w:tcPr>
+            <w:tcW w:type="dxa" w:w="2256"/>
+          </w:tcPr>
+          <w:p>
+            <w:r>
+              <w:rPr>
+                <w:b w:val="false"/>
+                <w:bCs w:val="false"/>
+                <w:color w:val="000000"/>
+                <w:sz w:val="19"/>
+                <w:szCs w:val="19"/>
+              </w:rPr>
+              <w:t xml:space="preserve">140-150 (acumulado)</w:t>
             </w:r>
           </w:p>
         </w:tc>
@@ -1477,52 +1567,139 @@
       <w:tr>
         <w:tc>
           <w:tcPr>
-            <w:tcW w:type="dxa" w:w="3008"/>
-          </w:tcPr>
-          <w:p>
-            <w:r>
-              <w:rPr>
-                <w:b w:val="false"/>
-                <w:bCs w:val="false"/>
-                <w:color w:val="000000"/>
-                <w:sz w:val="19"/>
-                <w:szCs w:val="19"/>
-              </w:rPr>
-              <w:t xml:space="preserve">Otimista</w:t>
-            </w:r>
-          </w:p>
-        </w:tc>
-        <w:tc>
-          <w:tcPr>
-            <w:tcW w:type="dxa" w:w="3008"/>
-          </w:tcPr>
-          <w:p>
-            <w:r>
-              <w:rPr>
-                <w:b w:val="false"/>
-                <w:bCs w:val="false"/>
-                <w:color w:val="000000"/>
-                <w:sz w:val="19"/>
-                <w:szCs w:val="19"/>
-              </w:rPr>
-              <w:t xml:space="preserve">~70 a 75</w:t>
-            </w:r>
-          </w:p>
-        </w:tc>
-        <w:tc>
-          <w:tcPr>
-            <w:tcW w:type="dxa" w:w="3008"/>
-          </w:tcPr>
-          <w:p>
-            <w:r>
-              <w:rPr>
-                <w:b w:val="false"/>
-                <w:bCs w:val="false"/>
-                <w:color w:val="000000"/>
-                <w:sz w:val="19"/>
-                <w:szCs w:val="19"/>
-              </w:rPr>
-              <w:t xml:space="preserve">+280 a +300</w:t>
+            <w:tcW w:type="dxa" w:w="2256"/>
+          </w:tcPr>
+          <w:p>
+            <w:r>
+              <w:rPr>
+                <w:b w:val="false"/>
+                <w:bCs w:val="false"/>
+                <w:color w:val="000000"/>
+                <w:sz w:val="19"/>
+                <w:szCs w:val="19"/>
+              </w:rPr>
+              <w:t xml:space="preserve">Dezembro/2026</w:t>
+            </w:r>
+          </w:p>
+        </w:tc>
+        <w:tc>
+          <w:tcPr>
+            <w:tcW w:type="dxa" w:w="2256"/>
+          </w:tcPr>
+          <w:p>
+            <w:r>
+              <w:rPr>
+                <w:b w:val="false"/>
+                <w:bCs w:val="false"/>
+                <w:color w:val="000000"/>
+                <w:sz w:val="19"/>
+                <w:szCs w:val="19"/>
+              </w:rPr>
+              <w:t xml:space="preserve">150 (acumulado)</w:t>
+            </w:r>
+          </w:p>
+        </w:tc>
+        <w:tc>
+          <w:tcPr>
+            <w:tcW w:type="dxa" w:w="2256"/>
+          </w:tcPr>
+          <w:p>
+            <w:r>
+              <w:rPr>
+                <w:b w:val="false"/>
+                <w:bCs w:val="false"/>
+                <w:color w:val="000000"/>
+                <w:sz w:val="19"/>
+                <w:szCs w:val="19"/>
+              </w:rPr>
+              <w:t xml:space="preserve">180 (acumulado)</w:t>
+            </w:r>
+          </w:p>
+        </w:tc>
+        <w:tc>
+          <w:tcPr>
+            <w:tcW w:type="dxa" w:w="2256"/>
+          </w:tcPr>
+          <w:p>
+            <w:r>
+              <w:rPr>
+                <w:b w:val="false"/>
+                <w:bCs w:val="false"/>
+                <w:color w:val="000000"/>
+                <w:sz w:val="19"/>
+                <w:szCs w:val="19"/>
+              </w:rPr>
+              <w:t xml:space="preserve">210-225 (acumulado)</w:t>
+            </w:r>
+          </w:p>
+        </w:tc>
+      </w:tr>
+      <w:tr>
+        <w:tc>
+          <w:tcPr>
+            <w:tcW w:type="dxa" w:w="2256"/>
+          </w:tcPr>
+          <w:p>
+            <w:r>
+              <w:rPr>
+                <w:b w:val="false"/>
+                <w:bCs w:val="false"/>
+                <w:color w:val="000000"/>
+                <w:sz w:val="19"/>
+                <w:szCs w:val="19"/>
+              </w:rPr>
+              <w:t xml:space="preserve">Janeiro/2027</w:t>
+            </w:r>
+          </w:p>
+        </w:tc>
+        <w:tc>
+          <w:tcPr>
+            <w:tcW w:type="dxa" w:w="2256"/>
+          </w:tcPr>
+          <w:p>
+            <w:r>
+              <w:rPr>
+                <w:b w:val="false"/>
+                <w:bCs w:val="false"/>
+                <w:color w:val="000000"/>
+                <w:sz w:val="19"/>
+                <w:szCs w:val="19"/>
+              </w:rPr>
+              <w:t xml:space="preserve">200 (acumulado)</w:t>
+            </w:r>
+          </w:p>
+        </w:tc>
+        <w:tc>
+          <w:tcPr>
+            <w:tcW w:type="dxa" w:w="2256"/>
+          </w:tcPr>
+          <w:p>
+            <w:r>
+              <w:rPr>
+                <w:b w:val="false"/>
+                <w:bCs w:val="false"/>
+                <w:color w:val="000000"/>
+                <w:sz w:val="19"/>
+                <w:szCs w:val="19"/>
+              </w:rPr>
+              <w:t xml:space="preserve">240 (acumulado)</w:t>
+            </w:r>
+          </w:p>
+        </w:tc>
+        <w:tc>
+          <w:tcPr>
+            <w:tcW w:type="dxa" w:w="2256"/>
+          </w:tcPr>
+          <w:p>
+            <w:r>
+              <w:rPr>
+                <w:b w:val="false"/>
+                <w:bCs w:val="false"/>
+                <w:color w:val="000000"/>
+                <w:sz w:val="19"/>
+                <w:szCs w:val="19"/>
+              </w:rPr>
+              <w:t xml:space="preserve">280-300 (acumulado)</w:t>
             </w:r>
           </w:p>
         </w:tc>
@@ -1532,6 +1709,82 @@
       <w:pPr>
         <w:spacing w:after="160"/>
       </w:pPr>
+    </w:p>
+    <w:p>
+      <w:pPr>
+        <w:spacing w:after="160"/>
+      </w:pPr>
+      <w:r>
+        <w:rPr>
+          <w:sz w:val="21"/>
+          <w:szCs w:val="21"/>
+        </w:rPr>
+        <w:t xml:space="preserve">Ou seja: até </w:t>
+      </w:r>
+      <w:r>
+        <w:rPr>
+          <w:b/>
+          <w:bCs/>
+          <w:sz w:val="21"/>
+          <w:szCs w:val="21"/>
+        </w:rPr>
+        <w:t xml:space="preserve">dezembro/2026</w:t>
+      </w:r>
+      <w:r>
+        <w:rPr>
+          <w:sz w:val="21"/>
+          <w:szCs w:val="21"/>
+        </w:rPr>
+        <w:t xml:space="preserve">, a margem fica entre </w:t>
+      </w:r>
+      <w:r>
+        <w:rPr>
+          <w:b/>
+          <w:bCs/>
+          <w:sz w:val="21"/>
+          <w:szCs w:val="21"/>
+        </w:rPr>
+        <w:t xml:space="preserve">+150 e +225 novos seguidores</w:t>
+      </w:r>
+      <w:r>
+        <w:rPr>
+          <w:sz w:val="21"/>
+          <w:szCs w:val="21"/>
+        </w:rPr>
+        <w:t xml:space="preserve"> desde outubro. Até </w:t>
+      </w:r>
+      <w:r>
+        <w:rPr>
+          <w:b/>
+          <w:bCs/>
+          <w:sz w:val="21"/>
+          <w:szCs w:val="21"/>
+        </w:rPr>
+        <w:t xml:space="preserve">janeiro/2027</w:t>
+      </w:r>
+      <w:r>
+        <w:rPr>
+          <w:sz w:val="21"/>
+          <w:szCs w:val="21"/>
+        </w:rPr>
+        <w:t xml:space="preserve">, entre </w:t>
+      </w:r>
+      <w:r>
+        <w:rPr>
+          <w:b/>
+          <w:bCs/>
+          <w:sz w:val="21"/>
+          <w:szCs w:val="21"/>
+        </w:rPr>
+        <w:t xml:space="preserve">+200 e +300 novos seguidores</w:t>
+      </w:r>
+      <w:r>
+        <w:rPr>
+          <w:sz w:val="21"/>
+          <w:szCs w:val="21"/>
+        </w:rPr>
+        <w:t xml:space="preserve"> desde outubro, mantendo o mesmo ritmo de investimento e sem mudança de estratégia.</w:t>
+      </w:r>
     </w:p>
     <w:p>
       <w:pPr>

</xml_diff>

<commit_message>
Adiciona projeção do total de seguidores (base 1.492) até dezembro/2026 e janeiro/2027
Co-Authored-By: Claude Sonnet 5 <noreply@anthropic.com>
Claude-Session: https://claude.ai/code/session_01GQSqEjEuqv44iBdACeUWUZ
</commit_message>
<xml_diff>
--- a/eleva/analise-crescimento-seguidores-jul-set-2026.docx
+++ b/eleva/analise-crescimento-seguidores-jul-set-2026.docx
@@ -1785,6 +1785,259 @@
         </w:rPr>
         <w:t xml:space="preserve"> desde outubro, mantendo o mesmo ritmo de investimento e sem mudança de estratégia.</w:t>
       </w:r>
+    </w:p>
+    <w:p>
+      <w:pPr>
+        <w:spacing w:after="80"/>
+      </w:pPr>
+      <w:r>
+        <w:rPr>
+          <w:i/>
+          <w:iCs/>
+          <w:color w:val="555555"/>
+          <w:sz w:val="18"/>
+          <w:szCs w:val="18"/>
+        </w:rPr>
+        <w:t xml:space="preserve">Total projetado (base atual: 1.492 seguidores)</w:t>
+      </w:r>
+    </w:p>
+    <w:tbl>
+      <w:tblPr>
+        <w:tblW w:type="dxa" w:w="9026"/>
+        <w:tblBorders>
+          <w:top w:val="single" w:color="auto" w:sz="4"/>
+          <w:left w:val="single" w:color="auto" w:sz="4"/>
+          <w:bottom w:val="single" w:color="auto" w:sz="4"/>
+          <w:right w:val="single" w:color="auto" w:sz="4"/>
+          <w:insideH w:val="single" w:color="auto" w:sz="4"/>
+          <w:insideV w:val="single" w:color="auto" w:sz="4"/>
+        </w:tblBorders>
+      </w:tblPr>
+      <w:tblGrid>
+        <w:gridCol w:w="2256"/>
+        <w:gridCol w:w="2256"/>
+        <w:gridCol w:w="2256"/>
+        <w:gridCol w:w="2256"/>
+      </w:tblGrid>
+      <w:tr>
+        <w:tc>
+          <w:tcPr>
+            <w:tcW w:type="dxa" w:w="2256"/>
+            <w:shd w:fill="1c2b4a" w:val="clear"/>
+          </w:tcPr>
+          <w:p>
+            <w:r>
+              <w:rPr>
+                <w:b/>
+                <w:bCs/>
+                <w:color w:val="FFFFFF"/>
+                <w:sz w:val="19"/>
+                <w:szCs w:val="19"/>
+              </w:rPr>
+              <w:t xml:space="preserve">Mês</w:t>
+            </w:r>
+          </w:p>
+        </w:tc>
+        <w:tc>
+          <w:tcPr>
+            <w:tcW w:type="dxa" w:w="2256"/>
+            <w:shd w:fill="1c2b4a" w:val="clear"/>
+          </w:tcPr>
+          <w:p>
+            <w:r>
+              <w:rPr>
+                <w:b/>
+                <w:bCs/>
+                <w:color w:val="FFFFFF"/>
+                <w:sz w:val="19"/>
+                <w:szCs w:val="19"/>
+              </w:rPr>
+              <w:t xml:space="preserve">Conservador</w:t>
+            </w:r>
+          </w:p>
+        </w:tc>
+        <w:tc>
+          <w:tcPr>
+            <w:tcW w:type="dxa" w:w="2256"/>
+            <w:shd w:fill="1c2b4a" w:val="clear"/>
+          </w:tcPr>
+          <w:p>
+            <w:r>
+              <w:rPr>
+                <w:b/>
+                <w:bCs/>
+                <w:color w:val="FFFFFF"/>
+                <w:sz w:val="19"/>
+                <w:szCs w:val="19"/>
+              </w:rPr>
+              <w:t xml:space="preserve">Realista</w:t>
+            </w:r>
+          </w:p>
+        </w:tc>
+        <w:tc>
+          <w:tcPr>
+            <w:tcW w:type="dxa" w:w="2256"/>
+            <w:shd w:fill="1c2b4a" w:val="clear"/>
+          </w:tcPr>
+          <w:p>
+            <w:r>
+              <w:rPr>
+                <w:b/>
+                <w:bCs/>
+                <w:color w:val="FFFFFF"/>
+                <w:sz w:val="19"/>
+                <w:szCs w:val="19"/>
+              </w:rPr>
+              <w:t xml:space="preserve">Otimista</w:t>
+            </w:r>
+          </w:p>
+        </w:tc>
+      </w:tr>
+      <w:tr>
+        <w:tc>
+          <w:tcPr>
+            <w:tcW w:type="dxa" w:w="2256"/>
+          </w:tcPr>
+          <w:p>
+            <w:r>
+              <w:rPr>
+                <w:b w:val="false"/>
+                <w:bCs w:val="false"/>
+                <w:color w:val="000000"/>
+                <w:sz w:val="19"/>
+                <w:szCs w:val="19"/>
+              </w:rPr>
+              <w:t xml:space="preserve">Dezembro/2026</w:t>
+            </w:r>
+          </w:p>
+        </w:tc>
+        <w:tc>
+          <w:tcPr>
+            <w:tcW w:type="dxa" w:w="2256"/>
+          </w:tcPr>
+          <w:p>
+            <w:r>
+              <w:rPr>
+                <w:b w:val="false"/>
+                <w:bCs w:val="false"/>
+                <w:color w:val="000000"/>
+                <w:sz w:val="19"/>
+                <w:szCs w:val="19"/>
+              </w:rPr>
+              <w:t xml:space="preserve">1.642</w:t>
+            </w:r>
+          </w:p>
+        </w:tc>
+        <w:tc>
+          <w:tcPr>
+            <w:tcW w:type="dxa" w:w="2256"/>
+          </w:tcPr>
+          <w:p>
+            <w:r>
+              <w:rPr>
+                <w:b w:val="false"/>
+                <w:bCs w:val="false"/>
+                <w:color w:val="000000"/>
+                <w:sz w:val="19"/>
+                <w:szCs w:val="19"/>
+              </w:rPr>
+              <w:t xml:space="preserve">1.672</w:t>
+            </w:r>
+          </w:p>
+        </w:tc>
+        <w:tc>
+          <w:tcPr>
+            <w:tcW w:type="dxa" w:w="2256"/>
+          </w:tcPr>
+          <w:p>
+            <w:r>
+              <w:rPr>
+                <w:b w:val="false"/>
+                <w:bCs w:val="false"/>
+                <w:color w:val="000000"/>
+                <w:sz w:val="19"/>
+                <w:szCs w:val="19"/>
+              </w:rPr>
+              <w:t xml:space="preserve">1.702 a 1.717</w:t>
+            </w:r>
+          </w:p>
+        </w:tc>
+      </w:tr>
+      <w:tr>
+        <w:tc>
+          <w:tcPr>
+            <w:tcW w:type="dxa" w:w="2256"/>
+          </w:tcPr>
+          <w:p>
+            <w:r>
+              <w:rPr>
+                <w:b w:val="false"/>
+                <w:bCs w:val="false"/>
+                <w:color w:val="000000"/>
+                <w:sz w:val="19"/>
+                <w:szCs w:val="19"/>
+              </w:rPr>
+              <w:t xml:space="preserve">Janeiro/2027</w:t>
+            </w:r>
+          </w:p>
+        </w:tc>
+        <w:tc>
+          <w:tcPr>
+            <w:tcW w:type="dxa" w:w="2256"/>
+          </w:tcPr>
+          <w:p>
+            <w:r>
+              <w:rPr>
+                <w:b w:val="false"/>
+                <w:bCs w:val="false"/>
+                <w:color w:val="000000"/>
+                <w:sz w:val="19"/>
+                <w:szCs w:val="19"/>
+              </w:rPr>
+              <w:t xml:space="preserve">1.692</w:t>
+            </w:r>
+          </w:p>
+        </w:tc>
+        <w:tc>
+          <w:tcPr>
+            <w:tcW w:type="dxa" w:w="2256"/>
+          </w:tcPr>
+          <w:p>
+            <w:r>
+              <w:rPr>
+                <w:b w:val="false"/>
+                <w:bCs w:val="false"/>
+                <w:color w:val="000000"/>
+                <w:sz w:val="19"/>
+                <w:szCs w:val="19"/>
+              </w:rPr>
+              <w:t xml:space="preserve">1.732</w:t>
+            </w:r>
+          </w:p>
+        </w:tc>
+        <w:tc>
+          <w:tcPr>
+            <w:tcW w:type="dxa" w:w="2256"/>
+          </w:tcPr>
+          <w:p>
+            <w:r>
+              <w:rPr>
+                <w:b w:val="false"/>
+                <w:bCs w:val="false"/>
+                <w:color w:val="000000"/>
+                <w:sz w:val="19"/>
+                <w:szCs w:val="19"/>
+              </w:rPr>
+              <w:t xml:space="preserve">1.772 a 1.792</w:t>
+            </w:r>
+          </w:p>
+        </w:tc>
+      </w:tr>
+    </w:tbl>
+    <w:p>
+      <w:pPr>
+        <w:spacing w:after="160"/>
+      </w:pPr>
     </w:p>
     <w:p>
       <w:pPr>

</xml_diff>

<commit_message>
Ajusta texto do custo por seguidor e adiciona sugestão de lives semanais/quinzenais para autoridade
Co-Authored-By: Claude Sonnet 5 <noreply@anthropic.com>
Claude-Session: https://claude.ai/code/session_01GQSqEjEuqv44iBdACeUWUZ
</commit_message>
<xml_diff>
--- a/eleva/analise-crescimento-seguidores-jul-set-2026.docx
+++ b/eleva/analise-crescimento-seguidores-jul-set-2026.docx
@@ -1146,7 +1146,28 @@
           <w:sz w:val="21"/>
           <w:szCs w:val="21"/>
         </w:rPr>
-        <w:t xml:space="preserve">. Vale lembrar que esse número é uma referência indireta, já que a campanha é de engajamento (visitas ao perfil), não de "seguir a página", parte desses 60 seguidores vem de conversão orgânica somada ao efeito da verba paga, não só de quem clicou direto no anúncio.</w:t>
+        <w:t xml:space="preserve">.</w:t>
+      </w:r>
+    </w:p>
+    <w:p>
+      <w:pPr>
+        <w:spacing w:after="160"/>
+      </w:pPr>
+      <w:r>
+        <w:rPr>
+          <w:b/>
+          <w:bCs/>
+          <w:sz w:val="21"/>
+          <w:szCs w:val="21"/>
+        </w:rPr>
+        <w:t xml:space="preserve">Sugestão:</w:t>
+      </w:r>
+      <w:r>
+        <w:rPr>
+          <w:sz w:val="21"/>
+          <w:szCs w:val="21"/>
+        </w:rPr>
+        <w:t xml:space="preserve"> testar, junto com o Giuliano, algumas peças de conteúdo com uma chamada direta para seguir a página (convidando quem está consumindo aquele conteúdo a continuar acompanhando e se aprofundar no tema). Isso ajuda a entender se um estímulo mais explícito dentro do próprio conteúdo melhora essa conversão a partir de outubro.</w:t>
       </w:r>
     </w:p>
     <w:p>
@@ -2088,7 +2109,49 @@
         <w:spacing w:after="150" w:before="300"/>
       </w:pPr>
       <w:r>
-        <w:t xml:space="preserve">Recomendações</w:t>
+        <w:t xml:space="preserve">Sugestão: lives semanais ou quinzenais para acelerar autoridade e seguidores</w:t>
+      </w:r>
+    </w:p>
+    <w:p>
+      <w:pPr>
+        <w:spacing w:after="160"/>
+      </w:pPr>
+      <w:r>
+        <w:rPr>
+          <w:sz w:val="21"/>
+          <w:szCs w:val="21"/>
+        </w:rPr>
+        <w:t xml:space="preserve">Um recurso que ainda não está sendo usado no perfil da Eleva é a live no Instagram. É um formato amplamente reconhecido no mercado de marketing digital como um dos que mais aceleram crescimento orgânico de perfil e construção de autoridade, justamente porque o Instagram entrega a live para uma fatia maior da base (avisando quem segue que a transmissão começou) e favorece esse tipo de conteúdo no alcance depois, por ser interação ao vivo. Nomes como Leandro Ladeira, Érico Rocha e outros criadores de referência em marketing e alta performance construíram parte relevante da autoridade e da base de seguidores deles com rotinas frequentes de live, em alguns casos diárias, em outros de duas a três vezes por semana, sustentadas por meses ou anos seguidos. </w:t>
+      </w:r>
+      <w:r>
+        <w:rPr>
+          <w:i/>
+          <w:iCs/>
+          <w:sz w:val="21"/>
+          <w:szCs w:val="21"/>
+        </w:rPr>
+        <w:t xml:space="preserve">(Vale confirmar os números exatos de cada um antes de citar publicamente para o Giuliano, aqui é usado como referência de mercado, não como dado fechado.)</w:t>
+      </w:r>
+    </w:p>
+    <w:p>
+      <w:pPr>
+        <w:spacing w:after="160"/>
+      </w:pPr>
+      <w:r>
+        <w:rPr>
+          <w:b/>
+          <w:bCs/>
+          <w:sz w:val="21"/>
+          <w:szCs w:val="21"/>
+        </w:rPr>
+        <w:t xml:space="preserve">Proposta de rotina para o Giuliano:</w:t>
+      </w:r>
+      <w:r>
+        <w:rPr>
+          <w:sz w:val="21"/>
+          <w:szCs w:val="21"/>
+        </w:rPr>
+        <w:t xml:space="preserve"> uma live fixa, semanal ou quinzenal, em dia e horário fixos (ex: toda quarta-feira, das 10h às 11h), alternando o tema a cada edição:</w:t>
       </w:r>
     </w:p>
     <w:p>
@@ -2105,7 +2168,7 @@
           <w:sz w:val="21"/>
           <w:szCs w:val="21"/>
         </w:rPr>
-        <w:t xml:space="preserve">Manter prioridade em vídeo (Reels e cortes de podcast), que segue puxando o alcance nos 3 meses.</w:t>
+        <w:t xml:space="preserve">Semana 1: pauta para síndicos</w:t>
       </w:r>
     </w:p>
     <w:p>
@@ -2122,7 +2185,7 @@
           <w:sz w:val="21"/>
           <w:szCs w:val="21"/>
         </w:rPr>
-        <w:t xml:space="preserve">Manter publicação no horário noturno, onde a base está mais ativa.</w:t>
+        <w:t xml:space="preserve">Semana 2: pauta para executivos de administradora</w:t>
       </w:r>
     </w:p>
     <w:p>
@@ -2139,7 +2202,7 @@
           <w:sz w:val="21"/>
           <w:szCs w:val="21"/>
         </w:rPr>
-        <w:t xml:space="preserve">Testar mais conteúdo direcionado à faixa 18-34 e ao público feminino, hoje sub-representados na base mas em crescimento.</w:t>
+        <w:t xml:space="preserve">Semana 3: pauta para fornecedores</w:t>
       </w:r>
     </w:p>
     <w:p>
@@ -2156,7 +2219,140 @@
           <w:sz w:val="21"/>
           <w:szCs w:val="21"/>
         </w:rPr>
+        <w:t xml:space="preserve">Semana 4: pauta para quem quer se tornar síndico, ou atualizações e ganchos do setor</w:t>
+      </w:r>
+    </w:p>
+    <w:p>
+      <w:pPr>
+        <w:spacing w:after="160"/>
+      </w:pPr>
+      <w:r>
+        <w:rPr>
+          <w:b/>
+          <w:bCs/>
+          <w:sz w:val="21"/>
+          <w:szCs w:val="21"/>
+        </w:rPr>
+        <w:t xml:space="preserve">Impacto esperado no médio e longo prazo:</w:t>
+      </w:r>
+      <w:r>
+        <w:rPr>
+          <w:sz w:val="21"/>
+          <w:szCs w:val="21"/>
+        </w:rPr>
+        <w:t xml:space="preserve"> com uma rotina consistente (mesmo que quinzenal ou mensal para começar), a tendência é reforçar a autoridade do Giuliano de forma mais rápida do que só com Reels e posts, porque a live cria um compromisso recorrente com a base, aumenta o tempo médio de consumo de conteúdo, e sinaliza para o algoritmo que aquele perfil gera interação ao vivo, o que tende a ampliar o alcance orgânico dos outros formatos também. Pode não gerar salto imediato em número de seguidores no primeiro mês, mas costuma ser um dos investimentos de tempo com melhor retorno de autoridade a médio prazo, o que reforça diretamente o objetivo de sustentar as vendas futuras de Diagnóstico e Mentoria. Vale considerar como meta ainda para este ano, nem que seja começando quinzenal, com plano de virar semanal em 2027.</w:t>
+      </w:r>
+    </w:p>
+    <w:p>
+      <w:pPr>
+        <w:pStyle w:val="Heading2"/>
+        <w:keepNext/>
+        <w:spacing w:after="150" w:before="300"/>
+      </w:pPr>
+      <w:r>
+        <w:t xml:space="preserve">Recomendações</w:t>
+      </w:r>
+    </w:p>
+    <w:p>
+      <w:pPr>
+        <w:pStyle w:val="ListParagraph"/>
+        <w:numPr>
+          <w:ilvl w:val="0"/>
+          <w:numId w:val="1"/>
+        </w:numPr>
+        <w:spacing w:after="80"/>
+      </w:pPr>
+      <w:r>
+        <w:rPr>
+          <w:sz w:val="21"/>
+          <w:szCs w:val="21"/>
+        </w:rPr>
+        <w:t xml:space="preserve">Manter prioridade em vídeo (Reels e cortes de podcast), que segue puxando o alcance nos 3 meses.</w:t>
+      </w:r>
+    </w:p>
+    <w:p>
+      <w:pPr>
+        <w:pStyle w:val="ListParagraph"/>
+        <w:numPr>
+          <w:ilvl w:val="0"/>
+          <w:numId w:val="1"/>
+        </w:numPr>
+        <w:spacing w:after="80"/>
+      </w:pPr>
+      <w:r>
+        <w:rPr>
+          <w:sz w:val="21"/>
+          <w:szCs w:val="21"/>
+        </w:rPr>
+        <w:t xml:space="preserve">Manter publicação no horário noturno, onde a base está mais ativa.</w:t>
+      </w:r>
+    </w:p>
+    <w:p>
+      <w:pPr>
+        <w:pStyle w:val="ListParagraph"/>
+        <w:numPr>
+          <w:ilvl w:val="0"/>
+          <w:numId w:val="1"/>
+        </w:numPr>
+        <w:spacing w:after="80"/>
+      </w:pPr>
+      <w:r>
+        <w:rPr>
+          <w:sz w:val="21"/>
+          <w:szCs w:val="21"/>
+        </w:rPr>
+        <w:t xml:space="preserve">Testar mais conteúdo direcionado à faixa 18-34 e ao público feminino, hoje sub-representados na base mas em crescimento.</w:t>
+      </w:r>
+    </w:p>
+    <w:p>
+      <w:pPr>
+        <w:pStyle w:val="ListParagraph"/>
+        <w:numPr>
+          <w:ilvl w:val="0"/>
+          <w:numId w:val="1"/>
+        </w:numPr>
+        <w:spacing w:after="80"/>
+      </w:pPr>
+      <w:r>
+        <w:rPr>
+          <w:sz w:val="21"/>
+          <w:szCs w:val="21"/>
+        </w:rPr>
         <w:t xml:space="preserve">Considerar reforçar presença em Porto Alegre e São Paulo, cidades que mais convertem seguidores hoje, com conteúdo ou anúncio segmentado.</w:t>
+      </w:r>
+    </w:p>
+    <w:p>
+      <w:pPr>
+        <w:pStyle w:val="ListParagraph"/>
+        <w:numPr>
+          <w:ilvl w:val="0"/>
+          <w:numId w:val="1"/>
+        </w:numPr>
+        <w:spacing w:after="80"/>
+      </w:pPr>
+      <w:r>
+        <w:rPr>
+          <w:sz w:val="21"/>
+          <w:szCs w:val="21"/>
+        </w:rPr>
+        <w:t xml:space="preserve">Testar conteúdos com chamada explícita para seguir a página.</w:t>
+      </w:r>
+    </w:p>
+    <w:p>
+      <w:pPr>
+        <w:pStyle w:val="ListParagraph"/>
+        <w:numPr>
+          <w:ilvl w:val="0"/>
+          <w:numId w:val="1"/>
+        </w:numPr>
+        <w:spacing w:after="80"/>
+      </w:pPr>
+      <w:r>
+        <w:rPr>
+          <w:sz w:val="21"/>
+          <w:szCs w:val="21"/>
+        </w:rPr>
+        <w:t xml:space="preserve">Avaliar iniciar uma rotina de lives (quinzenal ou mensal para começar) para acelerar autoridade e seguidores no médio prazo.</w:t>
       </w:r>
     </w:p>
     <w:sectPr>

</xml_diff>